<commit_message>
fix: repair account form checkbox layout
</commit_message>
<xml_diff>
--- a/assets/commercial/modele-email-creation-compte-entreprise-depannhome-pro.docx
+++ b/assets/commercial/modele-email-creation-compte-entreprise-depannhome-pro.docx
@@ -217,14 +217,6 @@
       <w:pPr>
         <w:spacing w:before="0" w:after="20" w:line="200" w:lineRule="auto"/>
       </w:pPr>
-      <w:r>
-        <w:rPr>
-          <w:rFonts w:ascii="Arial" w:hAnsi="Arial" w:cs="Arial"/>
-          <w:sz w:val="18"/>
-          <w:szCs w:val="18"/>
-        </w:rPr>
-        <w:t xml:space="preserve"/>
-      </w:r>
     </w:p>
     <w:p>
       <w:pPr>
@@ -296,14 +288,6 @@
       <w:pPr>
         <w:spacing w:before="0" w:after="20" w:line="200" w:lineRule="auto"/>
       </w:pPr>
-      <w:r>
-        <w:rPr>
-          <w:rFonts w:ascii="Arial" w:hAnsi="Arial" w:cs="Arial"/>
-          <w:sz w:val="18"/>
-          <w:szCs w:val="18"/>
-        </w:rPr>
-        <w:t xml:space="preserve"/>
-      </w:r>
     </w:p>
     <w:p>
       <w:pPr>
@@ -329,7 +313,55 @@
           <w:sz w:val="17"/>
           <w:szCs w:val="17"/>
         </w:rPr>
-        <w:t xml:space="preserve">Offre : ☐ Basic     ☐ Basic+     ☐ Pro</w:t>
+        <w:t xml:space="preserve">Offre : </w:t>
+      </w:r>
+      <w:r>
+        <w:rPr>
+          <w:rFonts w:ascii="Arial" w:hAnsi="Arial" w:cs="Arial"/>
+          <w:sz w:val="17"/>
+          <w:szCs w:val="17"/>
+        </w:rPr>
+        <w:sym w:font="Wingdings" w:char="F0A8"/>
+      </w:r>
+      <w:r>
+        <w:rPr>
+          <w:rFonts w:ascii="Arial" w:hAnsi="Arial" w:cs="Arial"/>
+          <w:sz w:val="17"/>
+          <w:szCs w:val="17"/>
+        </w:rPr>
+        <w:t xml:space="preserve"> Basic     </w:t>
+      </w:r>
+      <w:r>
+        <w:rPr>
+          <w:rFonts w:ascii="Arial" w:hAnsi="Arial" w:cs="Arial"/>
+          <w:sz w:val="17"/>
+          <w:szCs w:val="17"/>
+        </w:rPr>
+        <w:sym w:font="Wingdings" w:char="F0A8"/>
+      </w:r>
+      <w:r>
+        <w:rPr>
+          <w:rFonts w:ascii="Arial" w:hAnsi="Arial" w:cs="Arial"/>
+          <w:sz w:val="17"/>
+          <w:szCs w:val="17"/>
+        </w:rPr>
+        <w:t xml:space="preserve"> Basic+     </w:t>
+      </w:r>
+      <w:r>
+        <w:rPr>
+          <w:rFonts w:ascii="Arial" w:hAnsi="Arial" w:cs="Arial"/>
+          <w:sz w:val="17"/>
+          <w:szCs w:val="17"/>
+        </w:rPr>
+        <w:sym w:font="Wingdings" w:char="F0A8"/>
+      </w:r>
+      <w:r>
+        <w:rPr>
+          <w:rFonts w:ascii="Arial" w:hAnsi="Arial" w:cs="Arial"/>
+          <w:sz w:val="17"/>
+          <w:szCs w:val="17"/>
+        </w:rPr>
+        <w:t xml:space="preserve"> Pro</w:t>
       </w:r>
     </w:p>
     <w:p>
@@ -355,7 +387,55 @@
           <w:sz w:val="17"/>
           <w:szCs w:val="17"/>
         </w:rPr>
-        <w:t xml:space="preserve">Type d’interface : ☐ Standard  ☐ Groupe multi-entreprises  ☐ Partenaire</w:t>
+        <w:t xml:space="preserve">Type d’interface : </w:t>
+      </w:r>
+      <w:r>
+        <w:rPr>
+          <w:rFonts w:ascii="Arial" w:hAnsi="Arial" w:cs="Arial"/>
+          <w:sz w:val="17"/>
+          <w:szCs w:val="17"/>
+        </w:rPr>
+        <w:sym w:font="Wingdings" w:char="F0A8"/>
+      </w:r>
+      <w:r>
+        <w:rPr>
+          <w:rFonts w:ascii="Arial" w:hAnsi="Arial" w:cs="Arial"/>
+          <w:sz w:val="17"/>
+          <w:szCs w:val="17"/>
+        </w:rPr>
+        <w:t xml:space="preserve"> Standard  </w:t>
+      </w:r>
+      <w:r>
+        <w:rPr>
+          <w:rFonts w:ascii="Arial" w:hAnsi="Arial" w:cs="Arial"/>
+          <w:sz w:val="17"/>
+          <w:szCs w:val="17"/>
+        </w:rPr>
+        <w:sym w:font="Wingdings" w:char="F0A8"/>
+      </w:r>
+      <w:r>
+        <w:rPr>
+          <w:rFonts w:ascii="Arial" w:hAnsi="Arial" w:cs="Arial"/>
+          <w:sz w:val="17"/>
+          <w:szCs w:val="17"/>
+        </w:rPr>
+        <w:t xml:space="preserve"> Groupe multi-entreprises  </w:t>
+      </w:r>
+      <w:r>
+        <w:rPr>
+          <w:rFonts w:ascii="Arial" w:hAnsi="Arial" w:cs="Arial"/>
+          <w:sz w:val="17"/>
+          <w:szCs w:val="17"/>
+        </w:rPr>
+        <w:sym w:font="Wingdings" w:char="F0A8"/>
+      </w:r>
+      <w:r>
+        <w:rPr>
+          <w:rFonts w:ascii="Arial" w:hAnsi="Arial" w:cs="Arial"/>
+          <w:sz w:val="17"/>
+          <w:szCs w:val="17"/>
+        </w:rPr>
+        <w:t xml:space="preserve"> Partenaire</w:t>
       </w:r>
     </w:p>
     <w:p>
@@ -401,14 +481,6 @@
       <w:pPr>
         <w:spacing w:before="0" w:after="20" w:line="200" w:lineRule="auto"/>
       </w:pPr>
-      <w:r>
-        <w:rPr>
-          <w:rFonts w:ascii="Arial" w:hAnsi="Arial" w:cs="Arial"/>
-          <w:sz w:val="18"/>
-          <w:szCs w:val="18"/>
-        </w:rPr>
-        <w:t xml:space="preserve"/>
-      </w:r>
     </w:p>
     <w:p>
       <w:pPr>
@@ -499,34 +571,90 @@
           <w:sz w:val="17"/>
           <w:szCs w:val="17"/>
         </w:rPr>
-        <w:t xml:space="preserve">Recevoir des missions partenaires : ☐ Oui     ☐ Non</w:t>
-      </w:r>
-    </w:p>
-    <w:p>
-      <w:pPr>
-        <w:spacing w:before="0" w:after="15" w:line="200" w:lineRule="auto"/>
-      </w:pPr>
-      <w:r>
-        <w:rPr>
-          <w:rFonts w:ascii="Arial" w:hAnsi="Arial" w:cs="Arial"/>
-          <w:sz w:val="17"/>
-          <w:szCs w:val="17"/>
-        </w:rPr>
-        <w:t xml:space="preserve">Logo de l’entreprise joint : ☐ Oui     ☐ Non</w:t>
+        <w:t xml:space="preserve">Recevoir des missions partenaires : </w:t>
+      </w:r>
+      <w:r>
+        <w:rPr>
+          <w:rFonts w:ascii="Arial" w:hAnsi="Arial" w:cs="Arial"/>
+          <w:sz w:val="17"/>
+          <w:szCs w:val="17"/>
+        </w:rPr>
+        <w:sym w:font="Wingdings" w:char="F0A8"/>
+      </w:r>
+      <w:r>
+        <w:rPr>
+          <w:rFonts w:ascii="Arial" w:hAnsi="Arial" w:cs="Arial"/>
+          <w:sz w:val="17"/>
+          <w:szCs w:val="17"/>
+        </w:rPr>
+        <w:t xml:space="preserve"> Oui     </w:t>
+      </w:r>
+      <w:r>
+        <w:rPr>
+          <w:rFonts w:ascii="Arial" w:hAnsi="Arial" w:cs="Arial"/>
+          <w:sz w:val="17"/>
+          <w:szCs w:val="17"/>
+        </w:rPr>
+        <w:sym w:font="Wingdings" w:char="F0A8"/>
+      </w:r>
+      <w:r>
+        <w:rPr>
+          <w:rFonts w:ascii="Arial" w:hAnsi="Arial" w:cs="Arial"/>
+          <w:sz w:val="17"/>
+          <w:szCs w:val="17"/>
+        </w:rPr>
+        <w:t xml:space="preserve"> Non</w:t>
+      </w:r>
+    </w:p>
+    <w:p>
+      <w:pPr>
+        <w:spacing w:before="0" w:after="15" w:line="200" w:lineRule="auto"/>
+      </w:pPr>
+      <w:r>
+        <w:rPr>
+          <w:rFonts w:ascii="Arial" w:hAnsi="Arial" w:cs="Arial"/>
+          <w:sz w:val="17"/>
+          <w:szCs w:val="17"/>
+        </w:rPr>
+        <w:t xml:space="preserve">Logo de l’entreprise joint : </w:t>
+      </w:r>
+      <w:r>
+        <w:rPr>
+          <w:rFonts w:ascii="Arial" w:hAnsi="Arial" w:cs="Arial"/>
+          <w:sz w:val="17"/>
+          <w:szCs w:val="17"/>
+        </w:rPr>
+        <w:sym w:font="Wingdings" w:char="F0A8"/>
+      </w:r>
+      <w:r>
+        <w:rPr>
+          <w:rFonts w:ascii="Arial" w:hAnsi="Arial" w:cs="Arial"/>
+          <w:sz w:val="17"/>
+          <w:szCs w:val="17"/>
+        </w:rPr>
+        <w:t xml:space="preserve"> Oui     </w:t>
+      </w:r>
+      <w:r>
+        <w:rPr>
+          <w:rFonts w:ascii="Arial" w:hAnsi="Arial" w:cs="Arial"/>
+          <w:sz w:val="17"/>
+          <w:szCs w:val="17"/>
+        </w:rPr>
+        <w:sym w:font="Wingdings" w:char="F0A8"/>
+      </w:r>
+      <w:r>
+        <w:rPr>
+          <w:rFonts w:ascii="Arial" w:hAnsi="Arial" w:cs="Arial"/>
+          <w:sz w:val="17"/>
+          <w:szCs w:val="17"/>
+        </w:rPr>
+        <w:t xml:space="preserve"> Non</w:t>
       </w:r>
     </w:p>
     <w:p>
       <w:pPr>
         <w:spacing w:before="0" w:after="20" w:line="200" w:lineRule="auto"/>
       </w:pPr>
-      <w:r>
-        <w:rPr>
-          <w:rFonts w:ascii="Arial" w:hAnsi="Arial" w:cs="Arial"/>
-          <w:sz w:val="18"/>
-          <w:szCs w:val="18"/>
-        </w:rPr>
-        <w:t xml:space="preserve"/>
-      </w:r>
     </w:p>
     <w:p>
       <w:pPr>

</xml_diff>